<commit_message>
PantryChef: update to In Development status in 2-page Word resume
</commit_message>
<xml_diff>
--- a/Antoine_Victor_Resume_2page.docx
+++ b/Antoine_Victor_Resume_2page.docx
@@ -360,7 +360,7 @@
           <w:color w:val="1A1A1A"/>
           <w:sz w:val="19"/>
         </w:rPr>
-        <w:t xml:space="preserve"> — Designed full-stack lab app (Vapor 4, SwiftUI, OpenAPI 3.1, Fluent/PostgreSQL, JWT, Docker) where students ship real code as open-source contributors.</w:t>
+        <w:t xml:space="preserve"> — Designed full-stack lab app (Vapor 4, SwiftUI, OpenAPI 3.1, Fluent/PostgreSQL, JWT, Docker) currently under development; students will ship real code as open-source contributors upon delivery.</w:t>
       </w:r>
       <w:r>
         <w:rPr>
@@ -984,10 +984,10 @@
             <w:r/>
             <w:r>
               <w:rPr>
-                <w:color w:val="1A7A1A"/>
+                <w:color w:val="8A4800"/>
                 <w:sz w:val="17"/>
               </w:rPr>
-              <w:t>Production</w:t>
+              <w:t>In Development</w:t>
             </w:r>
           </w:p>
         </w:tc>
@@ -1005,7 +1005,7 @@
                 <w:color w:val="1A1A1A"/>
                 <w:sz w:val="17"/>
               </w:rPr>
-              <w:t>✅ Live</w:t>
+              <w:t>🚧 In Development</w:t>
             </w:r>
           </w:p>
         </w:tc>

</xml_diff>